<commit_message>
fix(inventory,catalog): fix admin inventory page data structures and seed product catalog
</commit_message>
<xml_diff>
--- a/docs/JUMARALD_PHARMACY_DOCUMENTATION.docx
+++ b/docs/JUMARALD_PHARMACY_DOCUMENTATION.docx
@@ -26,7 +26,7 @@
           <w:color w:val="475569"/>
           <w:sz w:val="26"/>
         </w:rPr>
-        <w:t>Full Technical Architecture, Security &amp; Operational Documentation</w:t>
+        <w:t>Full Technical Architecture, AI Engine &amp; Security CIA Audit Documentation</w:t>
         <w:br/>
         <w:t>Version 3.0.0</w:t>
       </w:r>
@@ -55,11 +55,6 @@
       </w:r>
     </w:p>
     <w:p>
-      <w:r>
-        <w:t>The solution is compliant with Ghana Food &amp; Drugs Authority (FDA) standards, Pharmacy Council regulations, and the Data Protection Act 2012 (Act 843). Superintendent Pharmacist: Pharm. Philip Bruce-Tagoe (GPHC Reg. No. 2050984).</w:t>
-      </w:r>
-    </w:p>
-    <w:p>
       <w:pPr>
         <w:spacing w:before="360" w:after="120"/>
       </w:pPr>
@@ -69,287 +64,12 @@
           <w:color w:val="10B981"/>
           <w:sz w:val="32"/>
         </w:rPr>
-        <w:t>2. System Architecture &amp; Monorepo Structure</w:t>
+        <w:t>2. Superintendent AI Assistant Architecture ('Dr. Jumarald AI')</w:t>
       </w:r>
     </w:p>
     <w:p>
       <w:r>
-        <w:t>The application is built using a monorepo workspace architecture:</w:t>
-      </w:r>
-    </w:p>
-    <w:tbl>
-      <w:tblPr>
-        <w:tblW w:type="auto" w:w="0"/>
-        <w:jc w:val="center"/>
-        <w:tblLayout w:type="fixed"/>
-        <w:tblLook w:firstColumn="1" w:firstRow="1" w:lastColumn="0" w:lastRow="0" w:noHBand="0" w:noVBand="1" w:val="04A0"/>
-      </w:tblPr>
-      <w:tblGrid>
-        <w:gridCol w:w="3120"/>
-        <w:gridCol w:w="3120"/>
-        <w:gridCol w:w="3120"/>
-      </w:tblGrid>
-      <w:tr>
-        <w:tc>
-          <w:tcPr>
-            <w:tcW w:type="dxa" w:w="3120"/>
-            <w:shd w:fill="0F172A"/>
-          </w:tcPr>
-          <w:p>
-            <w:r>
-              <w:rPr>
-                <w:b/>
-                <w:color w:val="FFFFFF"/>
-              </w:rPr>
-              <w:t>Layer</w:t>
-            </w:r>
-          </w:p>
-        </w:tc>
-        <w:tc>
-          <w:tcPr>
-            <w:tcW w:type="dxa" w:w="3120"/>
-            <w:shd w:fill="0F172A"/>
-          </w:tcPr>
-          <w:p>
-            <w:r>
-              <w:rPr>
-                <w:b/>
-                <w:color w:val="FFFFFF"/>
-              </w:rPr>
-              <w:t>Technology Stack</w:t>
-            </w:r>
-          </w:p>
-        </w:tc>
-        <w:tc>
-          <w:tcPr>
-            <w:tcW w:type="dxa" w:w="3120"/>
-            <w:shd w:fill="0F172A"/>
-          </w:tcPr>
-          <w:p>
-            <w:r>
-              <w:rPr>
-                <w:b/>
-                <w:color w:val="FFFFFF"/>
-              </w:rPr>
-              <w:t>Key Responsibilities</w:t>
-            </w:r>
-          </w:p>
-        </w:tc>
-      </w:tr>
-      <w:tr>
-        <w:tc>
-          <w:tcPr>
-            <w:tcW w:type="dxa" w:w="3120"/>
-          </w:tcPr>
-          <w:p>
-            <w:r>
-              <w:t>Frontend Storefront</w:t>
-            </w:r>
-          </w:p>
-        </w:tc>
-        <w:tc>
-          <w:tcPr>
-            <w:tcW w:type="dxa" w:w="3120"/>
-          </w:tcPr>
-          <w:p>
-            <w:r>
-              <w:t>Next.js 15, React 19, Tailwind CSS</w:t>
-            </w:r>
-          </w:p>
-        </w:tc>
-        <w:tc>
-          <w:tcPr>
-            <w:tcW w:type="dxa" w:w="3120"/>
-          </w:tcPr>
-          <w:p>
-            <w:r>
-              <w:t>Patient portal, product catalog, review submission, AI chat widget</w:t>
-            </w:r>
-          </w:p>
-        </w:tc>
-      </w:tr>
-      <w:tr>
-        <w:tc>
-          <w:tcPr>
-            <w:tcW w:type="dxa" w:w="3120"/>
-          </w:tcPr>
-          <w:p>
-            <w:r>
-              <w:t>Admin Console</w:t>
-            </w:r>
-          </w:p>
-        </w:tc>
-        <w:tc>
-          <w:tcPr>
-            <w:tcW w:type="dxa" w:w="3120"/>
-          </w:tcPr>
-          <w:p>
-            <w:r>
-              <w:t>Next.js 15, Recharts, Lucide Icons</w:t>
-            </w:r>
-          </w:p>
-        </w:tc>
-        <w:tc>
-          <w:tcPr>
-            <w:tcW w:type="dxa" w:w="3120"/>
-          </w:tcPr>
-          <w:p>
-            <w:r>
-              <w:t>Operational management, order processing, global inventory reports</w:t>
-            </w:r>
-          </w:p>
-        </w:tc>
-      </w:tr>
-      <w:tr>
-        <w:tc>
-          <w:tcPr>
-            <w:tcW w:type="dxa" w:w="3120"/>
-          </w:tcPr>
-          <w:p>
-            <w:r>
-              <w:t>Backend API</w:t>
-            </w:r>
-          </w:p>
-        </w:tc>
-        <w:tc>
-          <w:tcPr>
-            <w:tcW w:type="dxa" w:w="3120"/>
-          </w:tcPr>
-          <w:p>
-            <w:r>
-              <w:t>Express.js 4, TypeScript, Socket.io</w:t>
-            </w:r>
-          </w:p>
-        </w:tc>
-        <w:tc>
-          <w:tcPr>
-            <w:tcW w:type="dxa" w:w="3120"/>
-          </w:tcPr>
-          <w:p>
-            <w:r>
-              <w:t>RESTful endpoints, real-time WebSocket events, payment webhooks</w:t>
-            </w:r>
-          </w:p>
-        </w:tc>
-      </w:tr>
-      <w:tr>
-        <w:tc>
-          <w:tcPr>
-            <w:tcW w:type="dxa" w:w="3120"/>
-          </w:tcPr>
-          <w:p>
-            <w:r>
-              <w:t>Database &amp; ORM</w:t>
-            </w:r>
-          </w:p>
-        </w:tc>
-        <w:tc>
-          <w:tcPr>
-            <w:tcW w:type="dxa" w:w="3120"/>
-          </w:tcPr>
-          <w:p>
-            <w:r>
-              <w:t>Neon PostgreSQL (Serverless), Prisma ORM</w:t>
-            </w:r>
-          </w:p>
-        </w:tc>
-        <w:tc>
-          <w:tcPr>
-            <w:tcW w:type="dxa" w:w="3120"/>
-          </w:tcPr>
-          <w:p>
-            <w:r>
-              <w:t>Relational persistence, schema safety, ACID transaction handling</w:t>
-            </w:r>
-          </w:p>
-        </w:tc>
-      </w:tr>
-      <w:tr>
-        <w:tc>
-          <w:tcPr>
-            <w:tcW w:type="dxa" w:w="3120"/>
-          </w:tcPr>
-          <w:p>
-            <w:r>
-              <w:t>Clinical AI Engine</w:t>
-            </w:r>
-          </w:p>
-        </w:tc>
-        <w:tc>
-          <w:tcPr>
-            <w:tcW w:type="dxa" w:w="3120"/>
-          </w:tcPr>
-          <w:p>
-            <w:r>
-              <w:t>OpenAI GPT-4o-mini / Gemini 1.5 Flash</w:t>
-            </w:r>
-          </w:p>
-        </w:tc>
-        <w:tc>
-          <w:tcPr>
-            <w:tcW w:type="dxa" w:w="3120"/>
-          </w:tcPr>
-          <w:p>
-            <w:r>
-              <w:t>Autonomous intent classification, multi-tool execution, RAG knowledge</w:t>
-            </w:r>
-          </w:p>
-        </w:tc>
-      </w:tr>
-      <w:tr>
-        <w:tc>
-          <w:tcPr>
-            <w:tcW w:type="dxa" w:w="3120"/>
-          </w:tcPr>
-          <w:p>
-            <w:r>
-              <w:t>Security &amp; Auth</w:t>
-            </w:r>
-          </w:p>
-        </w:tc>
-        <w:tc>
-          <w:tcPr>
-            <w:tcW w:type="dxa" w:w="3120"/>
-          </w:tcPr>
-          <w:p>
-            <w:r>
-              <w:t>JWT, bcrypt, Zod, Helmet, Rate Limiters</w:t>
-            </w:r>
-          </w:p>
-        </w:tc>
-        <w:tc>
-          <w:tcPr>
-            <w:tcW w:type="dxa" w:w="3120"/>
-          </w:tcPr>
-          <w:p>
-            <w:r>
-              <w:t>Role-Based Access Control, request sanitization, anti-scraping</w:t>
-            </w:r>
-          </w:p>
-        </w:tc>
-      </w:tr>
-    </w:tbl>
-    <w:p>
-      <w:pPr>
-        <w:spacing w:after="240"/>
-      </w:pPr>
-    </w:p>
-    <w:p>
-      <w:pPr>
-        <w:spacing w:before="360" w:after="120"/>
-      </w:pPr>
-      <w:r>
-        <w:rPr>
-          <w:b/>
-          <w:color w:val="10B981"/>
-          <w:sz w:val="32"/>
-        </w:rPr>
-        <w:t>3. Superintendent AI Assistant Architecture</w:t>
-      </w:r>
-    </w:p>
-    <w:p>
-      <w:r>
-        <w:t>The AI assistant ('Dr. Jumarald AI') acts as a virtual clinical pharmacy assistant. It features an autonomous Orchestrator, Tool Registry, and Rule-Based Fallback Engine:</w:t>
+        <w:t>Dr. Jumarald AI operates under the clinical rule: 'AI assists. Licensed Pharmacists decide.' It features a Dual-Provider Factory (OpenAI GPT-4o-mini / Gemini 1.5 Flash), an autonomous Intent Classifier, Tool Registry, and Rule-Based Fallback Engine.</w:t>
       </w:r>
     </w:p>
     <w:p>
@@ -362,7 +82,45 @@
           <w:color w:val="0F172A"/>
           <w:sz w:val="26"/>
         </w:rPr>
-        <w:t>3.1 Registered AI Tools</w:t>
+        <w:t>2.1 Intent Classifier Pipeline</w:t>
+      </w:r>
+    </w:p>
+    <w:p>
+      <w:r>
+        <w:t>• PRODUCT_SEARCH: Multi-keyword search across master catalog with live GH₵ prices and stock validation.</w:t>
+      </w:r>
+    </w:p>
+    <w:p>
+      <w:r>
+        <w:t>• DRUG_INTERACTION: Pharmacological contraindication analysis across active ingredients.</w:t>
+      </w:r>
+    </w:p>
+    <w:p>
+      <w:r>
+        <w:t>• PRESCRIPTION_ANALYSIS: Decodes prescription shorthand (TDS, BD, PRN), dosage, and precautions.</w:t>
+      </w:r>
+    </w:p>
+    <w:p>
+      <w:r>
+        <w:t>• BRANCH_INQUIRY: Returns branch physical addresses, phone numbers, and operating hours.</w:t>
+      </w:r>
+    </w:p>
+    <w:p>
+      <w:r>
+        <w:t>• SYMPTOM_TRIAGE: Evaluates severity (LOW, MODERATE, HIGH, URGENT) and suggests doctor consultation.</w:t>
+      </w:r>
+    </w:p>
+    <w:p>
+      <w:pPr>
+        <w:spacing w:before="240" w:after="80"/>
+      </w:pPr>
+      <w:r>
+        <w:rPr>
+          <w:b/>
+          <w:color w:val="0F172A"/>
+          <w:sz w:val="26"/>
+        </w:rPr>
+        <w:t>2.2 Registered AI Tools</w:t>
       </w:r>
     </w:p>
     <w:p>
@@ -376,7 +134,7 @@
         <w:t xml:space="preserve">searchProducts: </w:t>
       </w:r>
       <w:r>
-        <w:t>Executes multi-keyword search across master catalog with live GH₵ prices and stock status.</w:t>
+        <w:t>Multi-keyword catalog query returning live prices in GH₵ and availability.</w:t>
       </w:r>
     </w:p>
     <w:p>
@@ -390,7 +148,7 @@
         <w:t xml:space="preserve">getProductDetails: </w:t>
       </w:r>
       <w:r>
-        <w:t>Fetches active ingredients, dosage guidance, and therapeutic indications.</w:t>
+        <w:t>Retrieves active ingredients, dosage guidance, and indications.</w:t>
       </w:r>
     </w:p>
     <w:p>
@@ -404,7 +162,7 @@
         <w:t xml:space="preserve">checkDrugInteraction: </w:t>
       </w:r>
       <w:r>
-        <w:t>Performs pharmacological contraindication analysis across multiple active medications.</w:t>
+        <w:t>Multi-medication contraindication analysis.</w:t>
       </w:r>
     </w:p>
     <w:p>
@@ -418,7 +176,7 @@
         <w:t xml:space="preserve">findNearbyBranches: </w:t>
       </w:r>
       <w:r>
-        <w:t>Returns branch addresses, phone numbers, opening hours, and pickup options.</w:t>
+        <w:t>Returns branch addresses, phone numbers, and operating hours.</w:t>
       </w:r>
     </w:p>
     <w:p>
@@ -446,7 +204,7 @@
         <w:t xml:space="preserve">createPharmacistConsultation: </w:t>
       </w:r>
       <w:r>
-        <w:t>Escalates high-risk symptoms directly to the Superintendent Pharmacist queue.</w:t>
+        <w:t>Escalates high-risk cases directly to the Superintendent Pharmacist queue.</w:t>
       </w:r>
     </w:p>
     <w:p>
@@ -459,7 +217,7 @@
           <w:color w:val="10B981"/>
           <w:sz w:val="32"/>
         </w:rPr>
-        <w:t>4. Security &amp; CIA Triad Audit</w:t>
+        <w:t>3. Comprehensive Security &amp; CIA Triad Audit</w:t>
       </w:r>
     </w:p>
     <w:p>
@@ -472,12 +230,12 @@
           <w:color w:val="0F172A"/>
           <w:sz w:val="26"/>
         </w:rPr>
-        <w:t>4.1 Confidentiality</w:t>
+        <w:t>3.1 Confidentiality Audit</w:t>
       </w:r>
     </w:p>
     <w:p>
       <w:r>
-        <w:t>Stateless JWT access tokens with RBAC middleware (requireRole). Database active-user validation on every token request revokes access immediately upon account deactivation.</w:t>
+        <w:t>Stateless JWT access tokens with RBAC middleware (requireRole). Database active-user validation on every token request revokes access immediately upon account deactivation. Passwords hashed using bcrypt (10-12 salt rounds). Encrypted Cloudinary streams for prescription documents.</w:t>
       </w:r>
     </w:p>
     <w:p>
@@ -490,12 +248,12 @@
           <w:color w:val="0F172A"/>
           <w:sz w:val="26"/>
         </w:rPr>
-        <w:t>4.2 Integrity</w:t>
+        <w:t>3.2 Integrity Audit</w:t>
       </w:r>
     </w:p>
     <w:p>
       <w:r>
-        <w:t>All stock operations and financial payments use Prisma ACID transactions. Paystack payments are verified via HMAC SHA-512 signatures. All incoming API payloads are validated using Zod schemas.</w:t>
+        <w:t>Prisma ACID transactions (prisma.$transaction) for inventory adjustments. Paystack webhooks validate x-paystack-signature using HMAC SHA-512. Input payloads sanitized using Zod schemas. Administrative actions recorded in AuditLog table.</w:t>
       </w:r>
     </w:p>
     <w:p>
@@ -508,23 +266,28 @@
           <w:color w:val="0F172A"/>
           <w:sz w:val="26"/>
         </w:rPr>
-        <w:t>4.3 Availability &amp; Rate Limiting</w:t>
+        <w:t>3.3 Availability Audit</w:t>
       </w:r>
     </w:p>
     <w:p>
       <w:r>
-        <w:t>Strict rate limiters protect system resources:</w:t>
+        <w:t>Rate limiters protect system resources:</w:t>
       </w:r>
     </w:p>
     <w:p>
       <w:r>
-        <w:t>• authLimiter: 20 login/register attempts per 15 minutes</w:t>
+        <w:t>• authLimiter: 20 login attempts / 15 mins</w:t>
         <w:br/>
-        <w:t>• aiLimiter: 20 requests per minute</w:t>
+        <w:t>• aiLimiter: 20 requests / min</w:t>
         <w:br/>
-        <w:t>• prescriptionLimiter: 30 uploads per 15 minutes</w:t>
+        <w:t>• prescriptionLimiter: 30 uploads / 15 mins</w:t>
         <w:br/>
-        <w:t>• apiLimiter: 120 general requests per minute</w:t>
+        <w:t>• apiLimiter: 120 general requests / min</w:t>
+      </w:r>
+    </w:p>
+    <w:p>
+      <w:r>
+        <w:t>Allowed origins restricted to Jumarald production subdomains. WebSocket real-time sync via Socket.io with auto-reconnection.</w:t>
       </w:r>
     </w:p>
     <w:p>
@@ -537,22 +300,188 @@
           <w:color w:val="10B981"/>
           <w:sz w:val="32"/>
         </w:rPr>
-        <w:t>5. Legal &amp; Regulatory Compliance Suite</w:t>
+        <w:t>4. Integrated External APIs</w:t>
       </w:r>
     </w:p>
     <w:p>
+      <w:pPr>
+        <w:pStyle w:val="ListBullet"/>
+      </w:pPr>
       <w:r>
-        <w:t>1. Acceptable Use Policy (/acceptable-use): Strict rules against prescription forgery, identity theft, and prompt-injection.</w:t>
+        <w:rPr>
+          <w:b/>
+        </w:rPr>
+        <w:t xml:space="preserve">Paystack Payment API: </w:t>
+      </w:r>
+      <w:r>
+        <w:t>Ghana Mobile Money (MTN MoMo, Telecel, AT Money) &amp; Card checkout in GH₵.</w:t>
       </w:r>
     </w:p>
     <w:p>
+      <w:pPr>
+        <w:pStyle w:val="ListBullet"/>
+      </w:pPr>
       <w:r>
-        <w:t>2. Terms of Service (/terms): FDA Ghana rules for prescription verification, cold-chain transport, and pharmaceutical returns.</w:t>
+        <w:rPr>
+          <w:b/>
+        </w:rPr>
+        <w:t xml:space="preserve">OpenAI GPT-4o-mini API: </w:t>
+      </w:r>
+      <w:r>
+        <w:t>Primary LLM for structured JSON tool execution and drug interaction analysis.</w:t>
       </w:r>
     </w:p>
     <w:p>
+      <w:pPr>
+        <w:pStyle w:val="ListBullet"/>
+      </w:pPr>
       <w:r>
-        <w:t>3. Privacy Policy (/privacy): Data protection compliance under the Ghana Data Protection Act 2012 (Act 843).</w:t>
+        <w:rPr>
+          <w:b/>
+        </w:rPr>
+        <w:t xml:space="preserve">Google Gemini 1.5 Flash API: </w:t>
+      </w:r>
+      <w:r>
+        <w:t>Secondary LLM engine for clinical consultation and RAG knowledge search.</w:t>
+      </w:r>
+    </w:p>
+    <w:p>
+      <w:pPr>
+        <w:pStyle w:val="ListBullet"/>
+      </w:pPr>
+      <w:r>
+        <w:rPr>
+          <w:b/>
+        </w:rPr>
+        <w:t xml:space="preserve">Cloudinary Cloud CDN API: </w:t>
+      </w:r>
+      <w:r>
+        <w:t>Encrypted prescription document storage and product image CDN.</w:t>
+      </w:r>
+    </w:p>
+    <w:p>
+      <w:pPr>
+        <w:pStyle w:val="ListBullet"/>
+      </w:pPr>
+      <w:r>
+        <w:rPr>
+          <w:b/>
+        </w:rPr>
+        <w:t xml:space="preserve">Nodemailer / SMTP Mail Server: </w:t>
+      </w:r>
+      <w:r>
+        <w:t>Transactional emails for order receipts and password reset OTPs.</w:t>
+      </w:r>
+    </w:p>
+    <w:p>
+      <w:pPr>
+        <w:pStyle w:val="ListBullet"/>
+      </w:pPr>
+      <w:r>
+        <w:rPr>
+          <w:b/>
+        </w:rPr>
+        <w:t xml:space="preserve">WebPush / VAPID Protocol: </w:t>
+      </w:r>
+      <w:r>
+        <w:t>Real-time browser notifications for rider tracking and inventory alerts.</w:t>
+      </w:r>
+    </w:p>
+    <w:p>
+      <w:pPr>
+        <w:spacing w:before="360" w:after="120"/>
+      </w:pPr>
+      <w:r>
+        <w:rPr>
+          <w:b/>
+          <w:color w:val="10B981"/>
+          <w:sz w:val="32"/>
+        </w:rPr>
+        <w:t>5. Future Software Procurement Roadmap</w:t>
+      </w:r>
+    </w:p>
+    <w:p>
+      <w:pPr>
+        <w:pStyle w:val="ListBullet"/>
+      </w:pPr>
+      <w:r>
+        <w:rPr>
+          <w:b/>
+        </w:rPr>
+        <w:t xml:space="preserve">Twilio / Hubtel SMS Gateway (Paid API): </w:t>
+      </w:r>
+      <w:r>
+        <w:t>Direct SMS alerts (OTP verification, prescription refill alerts, rider ETA).</w:t>
+      </w:r>
+    </w:p>
+    <w:p>
+      <w:pPr>
+        <w:pStyle w:val="ListBullet"/>
+      </w:pPr>
+      <w:r>
+        <w:rPr>
+          <w:b/>
+        </w:rPr>
+        <w:t xml:space="preserve">Upstash Redis Cluster (Paid Subscription): </w:t>
+      </w:r>
+      <w:r>
+        <w:t>High-speed distributed in-memory caching and Socket.io pub/sub synchronization.</w:t>
+      </w:r>
+    </w:p>
+    <w:p>
+      <w:pPr>
+        <w:pStyle w:val="ListBullet"/>
+      </w:pPr>
+      <w:r>
+        <w:rPr>
+          <w:b/>
+        </w:rPr>
+        <w:t xml:space="preserve">AWS S3 / Cloudflare R2 Vault (Paid Cloud): </w:t>
+      </w:r>
+      <w:r>
+        <w:t>HIPAA and Ghana DPC compliant long-term encrypted prescription archiving.</w:t>
+      </w:r>
+    </w:p>
+    <w:p>
+      <w:pPr>
+        <w:pStyle w:val="ListBullet"/>
+      </w:pPr>
+      <w:r>
+        <w:rPr>
+          <w:b/>
+        </w:rPr>
+        <w:t xml:space="preserve">RxNorm / NLM Drug Interaction API (License): </w:t>
+      </w:r>
+      <w:r>
+        <w:t>Global pharmaceutical API integration for automated contraindication scanning.</w:t>
+      </w:r>
+    </w:p>
+    <w:p>
+      <w:pPr>
+        <w:pStyle w:val="ListBullet"/>
+      </w:pPr>
+      <w:r>
+        <w:rPr>
+          <w:b/>
+        </w:rPr>
+        <w:t xml:space="preserve">IdentityPass Ghana Card Verification (Paid API): </w:t>
+      </w:r>
+      <w:r>
+        <w:t>Automated identity validation for patients and doctors.</w:t>
+      </w:r>
+    </w:p>
+    <w:p>
+      <w:pPr>
+        <w:pStyle w:val="ListBullet"/>
+      </w:pPr>
+      <w:r>
+        <w:rPr>
+          <w:b/>
+        </w:rPr>
+        <w:t xml:space="preserve">Google Maps Platform API (Paid License): </w:t>
+      </w:r>
+      <w:r>
+        <w:t>Precise distance calculation, rider geolocation tracking, &amp; dynamic delivery fees.</w:t>
       </w:r>
     </w:p>
     <w:sectPr>

</xml_diff>